<commit_message>
security: remove hardcoded admin defaults and hide secrets
</commit_message>
<xml_diff>
--- a/readme.docx
+++ b/readme.docx
@@ -404,19 +404,7 @@
         <w:t xml:space="preserve">ADMIN_KEY</w:t>
       </w:r>
       <w:r>
-        <w:t xml:space="preserve">（管理后台密钥，默认</w:t>
-      </w:r>
-      <w:r>
-        <w:t xml:space="preserve"> </w:t>
-      </w:r>
-      <w:r>
-        <w:rPr>
-          <w:rStyle w:val="VerbatimChar"/>
-        </w:rPr>
-        <w:t xml:space="preserve">admin888</w:t>
-      </w:r>
-      <w:r>
-        <w:t xml:space="preserve">）。</w:t>
+        <w:t xml:space="preserve">（管理后台密钥，请自行设置为强随机值，默认值已移除，切勿公开密钥）。</w:t>
       </w:r>
     </w:p>
     <w:bookmarkEnd w:id="23"/>

</xml_diff>